<commit_message>
Add local/business strategy docs: site concept, Golfer360 journey, budget
Adds PROJECT_BRIEF.md, MARKETING_ROADMAP.md, PRODUCT_REQUIREMENTS.md,
OPERATIONAL_PLAN.md, and DEI_Storck_Meeting_Prep.md capturing the finalized
Workhouse back-buildings site strategy, the Golfer360 4-phase customer
journey, and the modular-construction/regulatory-defense budget approach.

Updates CLAUDE.md and Fairway_Golf_Club_Business_Plan.docx with the founder's
in-house-development story, the leaner 2,000 sq ft Proof-of-Concept site
concept, and revised CapEx/breakeven figures. Regenerates
Fairway_Golf_Club_Executive_Summary.docx to match.

Committed ahead of pulling origin/main's kiosk/bay-screen work so these
doc-only changes don't get tangled up with that merge.

Co-Authored-By: Claude Sonnet 5 <noreply@anthropic.com>
</commit_message>
<xml_diff>
--- a/Fairway_Golf_Club_Business_Plan.docx
+++ b/Fairway_Golf_Club_Business_Plan.docx
@@ -1,5 +1,70 @@
 
-<file path=word/document.xml><?xml version="1.0" encoding="utf-8"?>
+<file path=customXml\item1.xml><?xml version="1.0" encoding="utf-8"?>
+<b:Sources xmlns:b="http://schemas.openxmlformats.org/officeDocument/2006/bibliography" xmlns="http://schemas.openxmlformats.org/officeDocument/2006/bibliography" SelectedStyle="/APA.XSL" StyleName="APA"/>
+</file>
+
+<file path=customXml\itemProps1.xml><?xml version="1.0" encoding="utf-8"?>
+<ds:datastoreItem xmlns:ds="http://schemas.openxmlformats.org/officeDocument/2006/customXml" ds:itemID="{EF278816-EC6F-A645-907D-7F25AECB1D4A}">
+  <ds:schemaRefs>
+    <ds:schemaRef ds:uri="http://schemas.openxmlformats.org/officeDocument/2006/bibliography"/>
+  </ds:schemaRefs>
+</ds:datastoreItem>
+</file>
+
+<file path=docProps\app.xml><?xml version="1.0" encoding="utf-8"?>
+<Properties xmlns="http://schemas.openxmlformats.org/officeDocument/2006/extended-properties" xmlns:vt="http://schemas.openxmlformats.org/officeDocument/2006/docPropsVTypes">
+  <Template>Normal.dotm</Template>
+  <TotalTime>0</TotalTime>
+  <Pages>1</Pages>
+  <Words>0</Words>
+  <Characters>0</Characters>
+  <Application>Microsoft Macintosh Word</Application>
+  <DocSecurity>0</DocSecurity>
+  <Lines>0</Lines>
+  <Paragraphs>0</Paragraphs>
+  <ScaleCrop>false</ScaleCrop>
+  <HeadingPairs>
+    <vt:vector size="2" baseType="variant">
+      <vt:variant>
+        <vt:lpstr>Title</vt:lpstr>
+      </vt:variant>
+      <vt:variant>
+        <vt:i4>1</vt:i4>
+      </vt:variant>
+    </vt:vector>
+  </HeadingPairs>
+  <TitlesOfParts>
+    <vt:vector size="1" baseType="lpstr">
+      <vt:lpstr/>
+    </vt:vector>
+  </TitlesOfParts>
+  <Manager/>
+  <Company/>
+  <LinksUpToDate>false</LinksUpToDate>
+  <CharactersWithSpaces>0</CharactersWithSpaces>
+  <SharedDoc>false</SharedDoc>
+  <HyperlinkBase/>
+  <HyperlinksChanged>false</HyperlinksChanged>
+  <AppVersion>14.0000</AppVersion>
+</Properties>
+</file>
+
+<file path=docProps\core.xml><?xml version="1.0" encoding="utf-8"?>
+<cp:coreProperties xmlns:cp="http://schemas.openxmlformats.org/package/2006/metadata/core-properties" xmlns:dc="http://purl.org/dc/elements/1.1/" xmlns:dcterms="http://purl.org/dc/terms/" xmlns:dcmitype="http://purl.org/dc/dcmitype/" xmlns:xsi="http://www.w3.org/2001/XMLSchema-instance">
+  <dc:title/>
+  <dc:subject/>
+  <dc:creator>python-docx</dc:creator>
+  <cp:keywords/>
+  <dc:description>generated by python-docx</dc:description>
+  <cp:lastModifiedBy/>
+  <cp:revision>1</cp:revision>
+  <dcterms:created xsi:type="dcterms:W3CDTF">2013-12-23T23:15:00Z</dcterms:created>
+  <dcterms:modified xsi:type="dcterms:W3CDTF">2013-12-23T23:15:00Z</dcterms:modified>
+  <cp:category/>
+</cp:coreProperties>
+</file>
+
+<file path=word\document.xml><?xml version="1.0" encoding="utf-8"?>
 <w:document xmlns:wpc="http://schemas.microsoft.com/office/word/2010/wordprocessingCanvas" xmlns:mo="http://schemas.microsoft.com/office/mac/office/2008/main" xmlns:mc="http://schemas.openxmlformats.org/markup-compatibility/2006" xmlns:mv="urn:schemas-microsoft-com:mac:vml" xmlns:o="urn:schemas-microsoft-com:office:office" xmlns:r="http://schemas.openxmlformats.org/officeDocument/2006/relationships" xmlns:m="http://schemas.openxmlformats.org/officeDocument/2006/math" xmlns:v="urn:schemas-microsoft-com:vml" xmlns:wp14="http://schemas.microsoft.com/office/word/2010/wordprocessingDrawing" xmlns:wp="http://schemas.openxmlformats.org/drawingml/2006/wordprocessingDrawing" xmlns:w10="urn:schemas-microsoft-com:office:word" xmlns:w="http://schemas.openxmlformats.org/wordprocessingml/2006/main" xmlns:w14="http://schemas.microsoft.com/office/word/2010/wordml" xmlns:wpg="http://schemas.microsoft.com/office/word/2010/wordprocessingGroup" xmlns:wpi="http://schemas.microsoft.com/office/word/2010/wordprocessingInk" xmlns:wne="http://schemas.microsoft.com/office/word/2006/wordml" xmlns:wps="http://schemas.microsoft.com/office/word/2010/wordprocessingShape" mc:Ignorable="w14 wp14">
   <w:body>
     <w:p/>
@@ -130,7 +195,7 @@
     </w:p>
     <w:p>
       <w:r>
-        <w:t>Our target market is affluent adults aged 28–55 in the Lorton/Fairfax Station corridor of Northern Virginia—a region with 580,000+ residents, median household incomes exceeding $130,000, and five busy golf courses within a 15-minute drive. These are professionals who already spend money on golf, value technology and data-driven self-improvement, and currently have zero premium indoor options within 15 minutes of their homes.</w:t>
+        <w:t>Our target market is affluent adults aged 28–55 in the Lorton/Fairfax Station corridor of Northern Virginia—a region with 580,000+ residents, median household incomes exceeding $130,000, and five busy golf courses within a 15-minute drive. These are professionals who already spend money on golf, value technology and data-driven self-improvement, and currently have zero premium indoor options within 15 minutes of their homes — driving 30+ minutes instead to reach non-premium, transactional regional simulators. Lorton specifically has a median household income of approximately $138,000 and an 89% white-collar workforce.</w:t>
       </w:r>
     </w:p>
     <w:p>
@@ -143,7 +208,7 @@
     </w:p>
     <w:p>
       <w:r>
-        <w:t>Fairway Golf Club will launch with 2 premium simulator bays (Phase 1), validate demand and achieve cash-flow positive operations within 90 days, and expand to 4 bays in Year 3. The Fairway Mobile portable unit will generate revenue and warm leads from day one. Long-term, the technology-first model and franchise-ready brand position Fairway for multi-location expansion across the Mid-Atlantic region.</w:t>
+        <w:t>Fairway Golf Club will launch as a lean, 2,000 sq ft “Proof-of-Concept” prototype — 2 premium overhead simulator bays, a warm walk-in arrival lobby, bag storage, and vintage country-club-style Men’s/Ladies’ restrooms — validate demand, and achieve cash-flow positive operations within 6 months, with a 4,000 sq ft / 4-bay expansion path already designed in. The Fairway Mobile portable unit will generate revenue and warm leads from day one. Long-term, the technology-first model and franchise-ready brand position Fairway for multi-location expansion across the Mid-Atlantic region.</w:t>
       </w:r>
     </w:p>
     <w:p>
@@ -188,7 +253,7 @@
         <w:t>Russell Evans</w:t>
       </w:r>
       <w:r>
-        <w:t xml:space="preserve"> — Founder, CEO, and technology architect. Salesforce professional with deep expertise in CRM, Data Cloud, Agentforce AI, and automation. Lives 1 mile from the facility location.</w:t>
+        <w:t xml:space="preserve"> — Founder, CEO, and Salesforce Application Developer. Russ is personally designing and coding the entire customized technology backend in-house — the Golfer360 platform, booking systems, and AI coaching engine — eliminating an estimated $40,000+ in software consulting and development fees. A Crosspointe resident living less than one mile from the target campus.</w:t>
       </w:r>
     </w:p>
     <w:p>
@@ -521,7 +586,7 @@
     </w:p>
     <w:p>
       <w:r>
-        <w:t>Fairway Golf Club must comply with: Virginia ABC licensing for on-premises beer/wine sales; Fairfax County commercial occupancy and ADA accessibility requirements; Virginia Department of Health food service permits (for packaged snacks); Fairfax County business license; standard commercial lease provisions at Workhouse Arts Center; and PCI-DSS compliance for credit card processing.</w:t>
+        <w:t>Fairway Golf Club must comply with: Virginia ABC licensing for on-premises beer/wine sales; Fairfax County commercial occupancy and ADA accessibility requirements; Virginia Department of Health food service permits (for packaged snacks); Fairfax County business license; standard commercial lease provisions at Workhouse Arts Center; and PCI-DSS compliance for credit card processing. Because the target site is a historic county building, all simulator enclosures and flooring are built as self-contained, freestanding wood-and-metal frame pods that avoid anchoring into the historic envelope, and restrooms use code-compliant above-floor macerating plumbing (e.g., Saniflo) rather than slab-cutting — a construction approach specifically designed to avoid triggering a full historic preservation review.</w:t>
       </w:r>
     </w:p>
     <w:p>
@@ -1018,7 +1083,7 @@
     </w:p>
     <w:p>
       <w:r>
-        <w:t>Total Phase 1 capital requirement: $150,000</w:t>
+        <w:t>Total Phase 1 capital requirement: approximately $70,000 (revised down from an original $150,000 estimate)</w:t>
       </w:r>
     </w:p>
     <w:p>
@@ -1026,7 +1091,7 @@
         <w:pStyle w:val="ListBullet"/>
       </w:pPr>
       <w:r>
-        <w:t>$75,000 equity from 3–5 founding investors (promissory notes at 8% annual return)</w:t>
+        <w:t>Reduced primarily by in-house Salesforce development — founder Russell Evans is personally coding the Golfer360 platform, booking systems, and AI coaching engine, eliminating an estimated $40,000+ in software consulting/development fees</w:t>
       </w:r>
     </w:p>
     <w:p>
@@ -1034,7 +1099,15 @@
         <w:pStyle w:val="ListBullet"/>
       </w:pPr>
       <w:r>
-        <w:t>$75,000 equipment loan (secured by simulators, 8% interest, 5-year term)</w:t>
+        <w:t>Further reduced by a modular, freestanding hardware build-out strategy that avoids costly historic-preservation construction requirements (see Regulations)</w:t>
+      </w:r>
+    </w:p>
+    <w:p>
+      <w:pPr>
+        <w:pStyle w:val="ListBullet"/>
+      </w:pPr>
+      <w:r>
+        <w:t>Funding structure (equity vs. loan split, if any outside capital is used at all) at this new, lower capital requirement is being finalized</w:t>
       </w:r>
     </w:p>
     <w:p>
@@ -1128,7 +1201,7 @@
         <w:pStyle w:val="ListBullet"/>
       </w:pPr>
       <w:r>
-        <w:t>Break-even: Month 3</w:t>
+        <w:t>Break-even: Month 6 (6 months from physical lounge launch)</w:t>
       </w:r>
     </w:p>
     <w:p>
@@ -1176,7 +1249,7 @@
         <w:pStyle w:val="ListBullet"/>
       </w:pPr>
       <w:r>
-        <w:t>Business is cash-flow positive within 90 days of launch</w:t>
+        <w:t>Business is projected cash-flow positive within 6 months of launch</w:t>
       </w:r>
     </w:p>
     <w:p>
@@ -1184,7 +1257,7 @@
         <w:pStyle w:val="ListBullet"/>
       </w:pPr>
       <w:r>
-        <w:t>Equipment retains ~55% resale value ($40K+ recovery in worst case)</w:t>
+        <w:t>Equipment retains ~55% resale value (dollar recovery to be recalculated at the new ~$70,000 capital base)</w:t>
       </w:r>
     </w:p>
     <w:p>
@@ -1200,7 +1273,7 @@
         <w:pStyle w:val="ListBullet"/>
       </w:pPr>
       <w:r>
-        <w:t>Worst-case scenario: liquidate equipment, exit lease, net loss ~$35K across all investors</w:t>
+        <w:t>Worst-case scenario: liquidate equipment, exit lease — modular construction and the lower ~$70,000 capital base limit downside exposure well below the original $150,000-basis estimate (exact updated worst-case figure not yet recalculated)</w:t>
       </w:r>
     </w:p>
     <w:sectPr>
@@ -1213,7 +1286,70 @@
 </w:document>
 </file>
 
-<file path=word/numbering.xml><?xml version="1.0" encoding="utf-8"?>
+<file path=word\fontTable.xml><?xml version="1.0" encoding="utf-8"?>
+<w:fonts xmlns:mc="http://schemas.openxmlformats.org/markup-compatibility/2006" xmlns:r="http://schemas.openxmlformats.org/officeDocument/2006/relationships" xmlns:w="http://schemas.openxmlformats.org/wordprocessingml/2006/main" xmlns:w14="http://schemas.microsoft.com/office/word/2010/wordml" mc:Ignorable="w14">
+  <w:font w:name="Symbol">
+    <w:panose1 w:val="00000000000000000000"/>
+    <w:charset w:val="02"/>
+    <w:family w:val="auto"/>
+    <w:pitch w:val="variable"/>
+    <w:sig w:usb0="00000000" w:usb1="10000000" w:usb2="00000000" w:usb3="00000000" w:csb0="80000000" w:csb1="00000000"/>
+  </w:font>
+  <w:font w:name="Times New Roman">
+    <w:panose1 w:val="02020603050405020304"/>
+    <w:charset w:val="00"/>
+    <w:family w:val="auto"/>
+    <w:pitch w:val="variable"/>
+    <w:sig w:usb0="E0002AFF" w:usb1="C0007841" w:usb2="00000009" w:usb3="00000000" w:csb0="000001FF" w:csb1="00000000"/>
+  </w:font>
+  <w:font w:name="Cambria">
+    <w:panose1 w:val="02040503050406030204"/>
+    <w:charset w:val="00"/>
+    <w:family w:val="auto"/>
+    <w:pitch w:val="variable"/>
+    <w:sig w:usb0="E00002FF" w:usb1="400004FF" w:usb2="00000000" w:usb3="00000000" w:csb0="0000019F" w:csb1="00000000"/>
+  </w:font>
+  <w:font w:name="ＭＳ 明朝">
+    <w:panose1 w:val="00000000000000000000"/>
+    <w:charset w:val="80"/>
+    <w:family w:val="roman"/>
+    <w:notTrueType/>
+    <w:pitch w:val="fixed"/>
+    <w:sig w:usb0="00000001" w:usb1="08070000" w:usb2="00000010" w:usb3="00000000" w:csb0="00020000" w:csb1="00000000"/>
+  </w:font>
+  <w:font w:name="Calibri">
+    <w:panose1 w:val="020F0502020204030204"/>
+    <w:charset w:val="00"/>
+    <w:family w:val="auto"/>
+    <w:pitch w:val="variable"/>
+    <w:sig w:usb0="E10002FF" w:usb1="4000ACFF" w:usb2="00000009" w:usb3="00000000" w:csb0="0000019F" w:csb1="00000000"/>
+  </w:font>
+  <w:font w:name="ＭＳ ゴシック">
+    <w:panose1 w:val="00000000000000000000"/>
+    <w:charset w:val="80"/>
+    <w:family w:val="modern"/>
+    <w:notTrueType/>
+    <w:pitch w:val="fixed"/>
+    <w:sig w:usb0="00000001" w:usb1="08070000" w:usb2="00000010" w:usb3="00000000" w:csb0="00020000" w:csb1="00000000"/>
+  </w:font>
+  <w:font w:name="Courier">
+    <w:panose1 w:val="02000500000000000000"/>
+    <w:charset w:val="00"/>
+    <w:family w:val="auto"/>
+    <w:pitch w:val="variable"/>
+    <w:sig w:usb0="00000003" w:usb1="00000000" w:usb2="00000000" w:usb3="00000000" w:csb0="00000001" w:csb1="00000000"/>
+  </w:font>
+  <w:font w:name="Arial">
+    <w:panose1 w:val="020B0604020202020204"/>
+    <w:charset w:val="00"/>
+    <w:family w:val="auto"/>
+    <w:pitch w:val="variable"/>
+    <w:sig w:usb0="E0002AFF" w:usb1="C0007843" w:usb2="00000009" w:usb3="00000000" w:csb0="000001FF" w:csb1="00000000"/>
+  </w:font>
+</w:fonts>
+</file>
+
+<file path=word\numbering.xml><?xml version="1.0" encoding="utf-8"?>
 <w:numbering xmlns:wpc="http://schemas.microsoft.com/office/word/2010/wordprocessingCanvas" xmlns:mo="http://schemas.microsoft.com/office/mac/office/2008/main" xmlns:mc="http://schemas.openxmlformats.org/markup-compatibility/2006" xmlns:mv="urn:schemas-microsoft-com:mac:vml" xmlns:o="urn:schemas-microsoft-com:office:office" xmlns:r="http://schemas.openxmlformats.org/officeDocument/2006/relationships" xmlns:m="http://schemas.openxmlformats.org/officeDocument/2006/math" xmlns:v="urn:schemas-microsoft-com:vml" xmlns:wp14="http://schemas.microsoft.com/office/word/2010/wordprocessingDrawing" xmlns:wp="http://schemas.openxmlformats.org/drawingml/2006/wordprocessingDrawing" xmlns:w10="urn:schemas-microsoft-com:office:word" xmlns:w="http://schemas.openxmlformats.org/wordprocessingml/2006/main" xmlns:w14="http://schemas.microsoft.com/office/word/2010/wordml" xmlns:wpg="http://schemas.microsoft.com/office/word/2010/wordprocessingGroup" xmlns:wpi="http://schemas.microsoft.com/office/word/2010/wordprocessingInk" xmlns:wne="http://schemas.microsoft.com/office/word/2006/wordml" xmlns:wps="http://schemas.microsoft.com/office/word/2010/wordprocessingShape" mc:Ignorable="w14 wp14">
   <w:abstractNum w:abstractNumId="0">
     <w:nsid w:val="FFFFFF7C"/>
@@ -1416,7 +1552,62 @@
 </w:numbering>
 </file>
 
-<file path=word/styles.xml><?xml version="1.0" encoding="utf-8"?>
+<file path=word\settings.xml><?xml version="1.0" encoding="utf-8"?>
+<w:settings xmlns:mc="http://schemas.openxmlformats.org/markup-compatibility/2006" xmlns:o="urn:schemas-microsoft-com:office:office" xmlns:r="http://schemas.openxmlformats.org/officeDocument/2006/relationships" xmlns:m="http://schemas.openxmlformats.org/officeDocument/2006/math" xmlns:v="urn:schemas-microsoft-com:vml" xmlns:w10="urn:schemas-microsoft-com:office:word" xmlns:w="http://schemas.openxmlformats.org/wordprocessingml/2006/main" xmlns:w14="http://schemas.microsoft.com/office/word/2010/wordml" xmlns:sl="http://schemas.openxmlformats.org/schemaLibrary/2006/main" mc:Ignorable="w14">
+  <w:zoom w:val="bestFit"/>
+  <w:proofState w:spelling="clean" w:grammar="clean"/>
+  <w:defaultTabStop w:val="720"/>
+  <w:characterSpacingControl w:val="doNotCompress"/>
+  <w:savePreviewPicture/>
+  <w:compat>
+    <w:useFELayout/>
+    <w:compatSetting w:name="compatibilityMode" w:uri="http://schemas.microsoft.com/office/word" w:val="14"/>
+    <w:compatSetting w:name="overrideTableStyleFontSizeAndJustification" w:uri="http://schemas.microsoft.com/office/word" w:val="1"/>
+    <w:compatSetting w:name="enableOpenTypeFeatures" w:uri="http://schemas.microsoft.com/office/word" w:val="1"/>
+    <w:compatSetting w:name="doNotFlipMirrorIndents" w:uri="http://schemas.microsoft.com/office/word" w:val="1"/>
+  </w:compat>
+  <w:rsids>
+    <w:rsidRoot w:val="00B47730"/>
+    <w:rsid w:val="00034616"/>
+    <w:rsid w:val="0006063C"/>
+    <w:rsid w:val="0015074B"/>
+    <w:rsid w:val="0029639D"/>
+    <w:rsid w:val="00326F90"/>
+    <w:rsid w:val="00AA1D8D"/>
+    <w:rsid w:val="00B47730"/>
+    <w:rsid w:val="00CB0664"/>
+    <w:rsid w:val="00FC693F"/>
+  </w:rsids>
+  <m:mathPr>
+    <m:mathFont m:val="Cambria Math"/>
+    <m:brkBin m:val="before"/>
+    <m:brkBinSub m:val="--"/>
+    <m:smallFrac m:val="0"/>
+    <m:dispDef/>
+    <m:lMargin m:val="0"/>
+    <m:rMargin m:val="0"/>
+    <m:defJc m:val="centerGroup"/>
+    <m:wrapIndent m:val="1440"/>
+    <m:intLim m:val="subSup"/>
+    <m:naryLim m:val="undOvr"/>
+  </m:mathPr>
+  <w:themeFontLang w:val="en-US" w:eastAsia="ja-JP"/>
+  <w:clrSchemeMapping w:bg1="light1" w:t1="dark1" w:bg2="light2" w:t2="dark2" w:accent1="accent1" w:accent2="accent2" w:accent3="accent3" w:accent4="accent4" w:accent5="accent5" w:accent6="accent6" w:hyperlink="hyperlink" w:followedHyperlink="followedHyperlink"/>
+  <w:doNotAutoCompressPictures/>
+  <w:shapeDefaults>
+    <o:shapedefaults v:ext="edit" spidmax="1027"/>
+    <o:shapelayout v:ext="edit">
+      <o:idmap v:ext="edit" data="1"/>
+    </o:shapelayout>
+  </w:shapeDefaults>
+  <w:decimalSymbol w:val="."/>
+  <w:listSeparator w:val=","/>
+  <w14:docId w14:val="24062061"/>
+  <w14:defaultImageDpi w14:val="300"/>
+</w:settings>
+</file>
+
+<file path=word\styles.xml><?xml version="1.0" encoding="utf-8"?>
 <w:styles xmlns:mc="http://schemas.openxmlformats.org/markup-compatibility/2006" xmlns:r="http://schemas.openxmlformats.org/officeDocument/2006/relationships" xmlns:w="http://schemas.openxmlformats.org/wordprocessingml/2006/main" xmlns:w14="http://schemas.microsoft.com/office/word/2010/wordml" mc:Ignorable="w14">
   <w:docDefaults>
     <w:rPrDefault>
@@ -13267,7 +13458,7 @@
 </w:styles>
 </file>
 
-<file path=word/stylesWithEffects.xml><?xml version="1.0" encoding="utf-8"?>
+<file path=word\stylesWithEffects.xml><?xml version="1.0" encoding="utf-8"?>
 <w:styles xmlns:wpc="http://schemas.microsoft.com/office/word/2010/wordprocessingCanvas" xmlns:mo="http://schemas.microsoft.com/office/mac/office/2008/main" xmlns:mc="http://schemas.openxmlformats.org/markup-compatibility/2006" xmlns:mv="urn:schemas-microsoft-com:mac:vml" xmlns:o="urn:schemas-microsoft-com:office:office" xmlns:r="http://schemas.openxmlformats.org/officeDocument/2006/relationships" xmlns:m="http://schemas.openxmlformats.org/officeDocument/2006/math" xmlns:v="urn:schemas-microsoft-com:vml" xmlns:wp14="http://schemas.microsoft.com/office/word/2010/wordprocessingDrawing" xmlns:wp="http://schemas.openxmlformats.org/drawingml/2006/wordprocessingDrawing" xmlns:w10="urn:schemas-microsoft-com:office:word" xmlns:w="http://schemas.openxmlformats.org/wordprocessingml/2006/main" xmlns:w14="http://schemas.microsoft.com/office/word/2010/wordml" xmlns:wpg="http://schemas.microsoft.com/office/word/2010/wordprocessingGroup" xmlns:wpi="http://schemas.microsoft.com/office/word/2010/wordprocessingInk" xmlns:wne="http://schemas.microsoft.com/office/word/2006/wordml" xmlns:wps="http://schemas.microsoft.com/office/word/2010/wordprocessingShape" mc:Ignorable="w14 wp14">
   <w:docDefaults>
     <w:rPrDefault>
@@ -25069,7 +25260,7 @@
 </w:styles>
 </file>
 
-<file path=word/theme/theme1.xml><?xml version="1.0" encoding="utf-8"?>
+<file path=word\theme\theme1.xml><?xml version="1.0" encoding="utf-8"?>
 <a:theme xmlns:a="http://schemas.openxmlformats.org/drawingml/2006/main" name="Office Theme">
   <a:themeElements>
     <a:clrScheme name="Office">
@@ -25389,14 +25580,9 @@
 </a:theme>
 </file>
 
-<file path=customXml/item1.xml><?xml version="1.0" encoding="utf-8"?>
-<b:Sources xmlns:b="http://schemas.openxmlformats.org/officeDocument/2006/bibliography" xmlns="http://schemas.openxmlformats.org/officeDocument/2006/bibliography" SelectedStyle="/APA.XSL" StyleName="APA"/>
-</file>
-
-<file path=customXml/itemProps1.xml><?xml version="1.0" encoding="utf-8"?>
-<ds:datastoreItem xmlns:ds="http://schemas.openxmlformats.org/officeDocument/2006/customXml" ds:itemID="{EF278816-EC6F-A645-907D-7F25AECB1D4A}">
-  <ds:schemaRefs>
-    <ds:schemaRef ds:uri="http://schemas.openxmlformats.org/officeDocument/2006/bibliography"/>
-  </ds:schemaRefs>
-</ds:datastoreItem>
+<file path=word\webSettings.xml><?xml version="1.0" encoding="utf-8"?>
+<w:webSettings xmlns:mc="http://schemas.openxmlformats.org/markup-compatibility/2006" xmlns:r="http://schemas.openxmlformats.org/officeDocument/2006/relationships" xmlns:w="http://schemas.openxmlformats.org/wordprocessingml/2006/main" xmlns:w14="http://schemas.microsoft.com/office/word/2010/wordml" mc:Ignorable="w14">
+  <w:allowPNG/>
+  <w:doNotSaveAsSingleFile/>
+</w:webSettings>
 </file>
</xml_diff>